<commit_message>
Remitos: transportista/chofer con buscador funcional (DNI para chofer), vehiculo-acoplado vinculado, numero sugerido; Productos: aviso de duplicado, baja, buscador real; fix general de buscador con autocompletado
</commit_message>
<xml_diff>
--- a/documentacion/Manual_Tecnico_Remitos.docx
+++ b/documentacion/Manual_Tecnico_Remitos.docx
@@ -9399,7 +9399,7 @@
           <w:sz w:val="30"/>
           <w:szCs w:val="30"/>
         </w:rPr>
-        <w:t xml:space="preserve">13. Pasos pendientes (a ejecutar en tu máquina)</w:t>
+        <w:t xml:space="preserve">13. Puesta en marcha en desarrollo local (ya hecho)</w:t>
       </w:r>
     </w:p>
     <w:p>
@@ -9411,7 +9411,7 @@
           <w:sz w:val="21"/>
           <w:szCs w:val="21"/>
         </w:rPr>
-        <w:t xml:space="preserve">No puedo correr comandos de manage.py de forma remota, así que estos pasos los tenés que hacer vos, en este orden, desde la carpeta del proyecto:</w:t>
+        <w:t xml:space="preserve">Esto ya se hizo y quedó funcionando en la máquina de desarrollo (Windows). Se deja documentado el orden real, incluyendo el problema que apareció en el camino, como referencia por si hay que repetirlo en otro entorno (ej. un servidor de pruebas nuevo).</w:t>
       </w:r>
     </w:p>
     <w:p>
@@ -9428,7 +9428,7 @@
           <w:sz w:val="21"/>
           <w:szCs w:val="21"/>
         </w:rPr>
-        <w:t xml:space="preserve">1. Borrar comprobantes/migrations/0003_seed_bolsa_bolson.py — quedó de una versión anterior en la que se iba a agregar BOLSA/BOLSÓN como códigos nuevos al nomenclador de AFIP; se descartó (sección 3.6), así que ese archivo ya no corresponde y hay que sacarlo antes del paso 2, para que la migración inicial de remitos no quede con una dependencia a un archivo que ya no existe.</w:t>
+        <w:t xml:space="preserve">1. Se borró comprobantes/migrations/0003_seed_bolsa_bolson.py — quedó de una versión anterior en la que se iba a agregar BOLSA/BOLSÓN como códigos nuevos al nomenclador de AFIP; se descartó (sección 3.6). Se confirmó con showmigrations comprobantes que nunca llegó a aplicarse, así que no quedó ninguna fila a limpiar.</w:t>
       </w:r>
     </w:p>
     <w:p>
@@ -9445,7 +9445,7 @@
           <w:sz w:val="21"/>
           <w:szCs w:val="21"/>
         </w:rPr>
-        <w:t xml:space="preserve">2. python manage.py makemigrations remitos  →  esto va a fallar tal cual si remitos/migrations/0002_seed_condicion_venta.py ya está en la carpeta (depende de 0001_initial, que es justo lo que este comando tiene que generar). Solución: sacar 0002_seed_condicion_venta.py de la carpeta migrations un momento, correr el comando (genera 0001_initial.py), y devolverlo a su lugar:</w:t>
+        <w:t xml:space="preserve">2. python manage.py makemigrations remitos  →  la primera vez esto falló, porque remitos/migrations/0002_seed_condicion_venta.py ya estaba en la carpeta y depende de 0001_initial, que es justo lo que este comando tiene que generar. Se resolvió sacando 0002_seed_condicion_venta.py de la carpeta un momento, corriendo el comando (genera 0001_initial.py) y devolviéndolo a su lugar:</w:t>
       </w:r>
     </w:p>
     <w:p>
@@ -9493,6 +9493,34 @@
     </w:p>
     <w:p>
       <w:pPr>
+        <w:pBdr>
+          <w:left w:val="single" w:color="9A3412" w:sz="18" w:space="6"/>
+        </w:pBdr>
+        <w:shd w:fill="FFF7ED" w:val="clear"/>
+        <w:spacing w:before="60" w:after="200" w:line="290"/>
+        <w:ind w:left="120"/>
+      </w:pPr>
+      <w:r>
+        <w:rPr>
+          <w:b/>
+          <w:bCs/>
+          <w:color w:val="9A3412"/>
+          <w:sz w:val="20"/>
+          <w:szCs w:val="20"/>
+        </w:rPr>
+        <w:t xml:space="preserve">Atención: </w:t>
+      </w:r>
+      <w:r>
+        <w:rPr>
+          <w:color w:val="9A3412"/>
+          <w:sz w:val="20"/>
+          <w:szCs w:val="20"/>
+        </w:rPr>
+        <w:t xml:space="preserve">Los tres comandos de arriba hay que tipearlos o pegarlos DE A UNO, apretando Enter después de cada uno. Pegados todos juntos de una vez, la consola de Windows los interpreta como un solo comando gigante y rompe todo (es justo lo que pasó la primera vez: un “move” con el destino mal armado, que aparte dejó un archivo 0002_seed_condicion_venta.py suelto en la raíz del proyecto en vez de en migrations/ — se detectó y se borró antes de commitear).</w:t>
+      </w:r>
+    </w:p>
+    <w:p>
+      <w:pPr>
         <w:pStyle w:val="ListParagraph"/>
         <w:numPr>
           <w:ilvl w:val="0"/>
@@ -9505,7 +9533,7 @@
           <w:sz w:val="21"/>
           <w:szCs w:val="21"/>
         </w:rPr>
-        <w:t xml:space="preserve">3. python manage.py migrate  →  aplica remitos.0001_initial + 0002_seed_condicion_venta y entidades.0008_grupo_remitos.</w:t>
+        <w:t xml:space="preserve">3. python manage.py migrate  →  aplicó remitos.0001_initial + 0002_seed_condicion_venta y entidades.0008_grupo_remitos, sin errores.</w:t>
       </w:r>
     </w:p>
     <w:p>
@@ -9522,7 +9550,7 @@
           <w:sz w:val="21"/>
           <w:szCs w:val="21"/>
         </w:rPr>
-        <w:t xml:space="preserve">4. Reiniciar el servicio de waitress/systemd para que tome el código nuevo.</w:t>
+        <w:t xml:space="preserve">4. Reiniciar el servicio (en desarrollo, el propio runserver) para que tome el código nuevo.</w:t>
       </w:r>
     </w:p>
     <w:p>
@@ -9544,10 +9572,414 @@
     </w:p>
     <w:p>
       <w:pPr>
+        <w:spacing w:after="160" w:line="300"/>
+      </w:pPr>
+      <w:r>
+        <w:rPr>
+          <w:sz w:val="21"/>
+          <w:szCs w:val="21"/>
+        </w:rPr>
+        <w:t xml:space="preserve">Con eso el módulo quedó operativo end-to-end en desarrollo: alta de Remito → alta de renglones (genera los Movimiento) → confirmación de kilogramos_confirmados cuando corresponda → impresión → reportes.</w:t>
+      </w:r>
+    </w:p>
+    <w:p>
+      <w:pPr>
+        <w:pStyle w:val="Heading1"/>
         <w:pBdr>
-          <w:left w:val="single" w:color="166534" w:sz="18" w:space="6"/>
+          <w:bottom w:val="single" w:color="0F6B4C" w:sz="6" w:space="4"/>
         </w:pBdr>
-        <w:shd w:fill="F0FDF4" w:val="clear"/>
+        <w:spacing w:before="360" w:after="160"/>
+      </w:pPr>
+      <w:r>
+        <w:rPr>
+          <w:b/>
+          <w:bCs/>
+          <w:color w:val="0F6B4C"/>
+          <w:sz w:val="30"/>
+          <w:szCs w:val="30"/>
+        </w:rPr>
+        <w:t xml:space="preserve">14. Corrección posterior: submenús del navbar que se abrían fuera de pantalla</w:t>
+      </w:r>
+    </w:p>
+    <w:p>
+      <w:pPr>
+        <w:spacing w:after="160" w:line="300"/>
+      </w:pPr>
+      <w:r>
+        <w:rPr>
+          <w:sz w:val="21"/>
+          <w:szCs w:val="21"/>
+        </w:rPr>
+        <w:t xml:space="preserve">Al probarlo, los submenús de Remitos (Renglones, Vehículos, Acoplados, Condiciones de venta, Observaciones estándar) no mostraban sus opciones — solo se veía la flechita del ítem, sin nada al hacer clic.</w:t>
+      </w:r>
+    </w:p>
+    <w:p>
+      <w:pPr>
+        <w:pStyle w:val="Heading2"/>
+        <w:spacing w:before="280" w:after="120"/>
+      </w:pPr>
+      <w:r>
+        <w:rPr>
+          <w:b/>
+          <w:bCs/>
+          <w:color w:val="1F2937"/>
+          <w:sz w:val="24"/>
+          <w:szCs w:val="24"/>
+        </w:rPr>
+        <w:t xml:space="preserve">14.1. Causa</w:t>
+      </w:r>
+    </w:p>
+    <w:p>
+      <w:pPr>
+        <w:spacing w:after="160" w:line="300"/>
+      </w:pPr>
+      <w:r>
+        <w:rPr>
+          <w:sz w:val="21"/>
+          <w:szCs w:val="21"/>
+        </w:rPr>
+        <w:t xml:space="preserve">Cada submenú (.dropdown-submenu, ver templates/navbar.html) se abre por CSS hacia la derecha del texto (left: 100%, ver static/css/styles.css), superpuesto al costado. Remitos quedó como el último ítem del menú principal, pegado al borde derecho de la ventana — así que sus submenús, al intentar abrirse todavía más a la derecha, terminaban renderizados completamente fuera de la pantalla. Se confirmó abriendo el sitio real y midiendo la posición: el submenú de Renglones se dibujaba entre los píxeles 1440 y 1600 en una ventana de 1440 px de ancho, es decir, 100% invisible sin desplazar la página hacia la derecha. No es un problema exclusivo de Remitos: le puede pasar a cualquier submenú que no tenga lugar a la derecha (antes no se había notado porque ningún otro ítem del menú quedaba tan pegado al borde).</w:t>
+      </w:r>
+    </w:p>
+    <w:p>
+      <w:pPr>
+        <w:pStyle w:val="Heading2"/>
+        <w:spacing w:before="280" w:after="120"/>
+      </w:pPr>
+      <w:r>
+        <w:rPr>
+          <w:b/>
+          <w:bCs/>
+          <w:color w:val="1F2937"/>
+          <w:sz w:val="24"/>
+          <w:szCs w:val="24"/>
+        </w:rPr>
+        <w:t xml:space="preserve">14.2. Corrección</w:t>
+      </w:r>
+    </w:p>
+    <w:p>
+      <w:pPr>
+        <w:spacing w:after="160" w:line="300"/>
+      </w:pPr>
+      <w:r>
+        <w:rPr>
+          <w:sz w:val="21"/>
+          <w:szCs w:val="21"/>
+        </w:rPr>
+        <w:t xml:space="preserve">Se agregó, en templates/navbar.html, una función posicionarSubmenu() que mide el lugar disponible antes de abrir cada submenú (tanto al hacer clic como al pasar el mouse por encima) y, si no entra a la derecha, le agrega la clase abre-izquierda:</w:t>
+      </w:r>
+    </w:p>
+    <w:p>
+      <w:pPr>
+        <w:pBdr>
+          <w:left w:val="single" w:color="1F2937" w:sz="18" w:space="6"/>
+        </w:pBdr>
+        <w:shd w:fill="F3F4F6" w:val="clear"/>
+        <w:spacing w:after="160" w:line="270"/>
+        <w:ind w:left="120"/>
+      </w:pPr>
+      <w:r>
+        <w:rPr>
+          <w:color w:val="111827"/>
+          <w:sz w:val="18"/>
+          <w:szCs w:val="18"/>
+          <w:rFonts w:ascii="Courier New" w:cs="Courier New" w:eastAsia="Courier New" w:hAnsi="Courier New"/>
+        </w:rPr>
+        <w:t xml:space="preserve">function posicionarSubmenu(submenu) {</w:t>
+      </w:r>
+      <w:r>
+        <w:br/>
+      </w:r>
+      <w:r>
+        <w:rPr>
+          <w:color w:val="111827"/>
+          <w:sz w:val="18"/>
+          <w:szCs w:val="18"/>
+          <w:rFonts w:ascii="Courier New" w:cs="Courier New" w:eastAsia="Courier New" w:hAnsi="Courier New"/>
+        </w:rPr>
+        <w:t xml:space="preserve">    var menu = submenu.querySelector(':scope &gt; .dropdown-menu');</w:t>
+      </w:r>
+      <w:r>
+        <w:br/>
+      </w:r>
+      <w:r>
+        <w:rPr>
+          <w:color w:val="111827"/>
+          <w:sz w:val="18"/>
+          <w:szCs w:val="18"/>
+          <w:rFonts w:ascii="Courier New" w:cs="Courier New" w:eastAsia="Courier New" w:hAnsi="Courier New"/>
+        </w:rPr>
+        <w:t xml:space="preserve">    if (!menu) return;</w:t>
+      </w:r>
+      <w:r>
+        <w:br/>
+      </w:r>
+      <w:r>
+        <w:rPr>
+          <w:color w:val="111827"/>
+          <w:sz w:val="18"/>
+          <w:szCs w:val="18"/>
+          <w:rFonts w:ascii="Courier New" w:cs="Courier New" w:eastAsia="Courier New" w:hAnsi="Courier New"/>
+        </w:rPr>
+        <w:t xml:space="preserve">    submenu.classList.remove('abre-izquierda');</w:t>
+      </w:r>
+      <w:r>
+        <w:br/>
+      </w:r>
+      <w:r>
+        <w:rPr>
+          <w:color w:val="111827"/>
+          <w:sz w:val="18"/>
+          <w:szCs w:val="18"/>
+          <w:rFonts w:ascii="Courier New" w:cs="Courier New" w:eastAsia="Courier New" w:hAnsi="Courier New"/>
+        </w:rPr>
+        <w:t xml:space="preserve">    var rect = menu.getBoundingClientRect();</w:t>
+      </w:r>
+      <w:r>
+        <w:br/>
+      </w:r>
+      <w:r>
+        <w:rPr>
+          <w:color w:val="111827"/>
+          <w:sz w:val="18"/>
+          <w:szCs w:val="18"/>
+          <w:rFonts w:ascii="Courier New" w:cs="Courier New" w:eastAsia="Courier New" w:hAnsi="Courier New"/>
+        </w:rPr>
+        <w:t xml:space="preserve">    if (rect.right &gt; window.innerWidth) {</w:t>
+      </w:r>
+      <w:r>
+        <w:br/>
+      </w:r>
+      <w:r>
+        <w:rPr>
+          <w:color w:val="111827"/>
+          <w:sz w:val="18"/>
+          <w:szCs w:val="18"/>
+          <w:rFonts w:ascii="Courier New" w:cs="Courier New" w:eastAsia="Courier New" w:hAnsi="Courier New"/>
+        </w:rPr>
+        <w:t xml:space="preserve">        submenu.classList.add('abre-izquierda');</w:t>
+      </w:r>
+      <w:r>
+        <w:br/>
+      </w:r>
+      <w:r>
+        <w:rPr>
+          <w:color w:val="111827"/>
+          <w:sz w:val="18"/>
+          <w:szCs w:val="18"/>
+          <w:rFonts w:ascii="Courier New" w:cs="Courier New" w:eastAsia="Courier New" w:hAnsi="Courier New"/>
+        </w:rPr>
+        <w:t xml:space="preserve">    }</w:t>
+      </w:r>
+      <w:r>
+        <w:br/>
+      </w:r>
+      <w:r>
+        <w:rPr>
+          <w:color w:val="111827"/>
+          <w:sz w:val="18"/>
+          <w:szCs w:val="18"/>
+          <w:rFonts w:ascii="Courier New" w:cs="Courier New" w:eastAsia="Courier New" w:hAnsi="Courier New"/>
+        </w:rPr>
+        <w:t xml:space="preserve">}</w:t>
+      </w:r>
+    </w:p>
+    <w:p>
+      <w:pPr>
+        <w:spacing w:after="160" w:line="300"/>
+      </w:pPr>
+      <w:r>
+        <w:rPr>
+          <w:sz w:val="21"/>
+          <w:szCs w:val="21"/>
+        </w:rPr>
+        <w:t xml:space="preserve">Y en static/css/styles.css, la clase que invierte el lado de apertura:</w:t>
+      </w:r>
+    </w:p>
+    <w:p>
+      <w:pPr>
+        <w:pBdr>
+          <w:left w:val="single" w:color="1F2937" w:sz="18" w:space="6"/>
+        </w:pBdr>
+        <w:shd w:fill="F3F4F6" w:val="clear"/>
+        <w:spacing w:after="160" w:line="270"/>
+        <w:ind w:left="120"/>
+      </w:pPr>
+      <w:r>
+        <w:rPr>
+          <w:color w:val="111827"/>
+          <w:sz w:val="18"/>
+          <w:szCs w:val="18"/>
+          <w:rFonts w:ascii="Courier New" w:cs="Courier New" w:eastAsia="Courier New" w:hAnsi="Courier New"/>
+        </w:rPr>
+        <w:t xml:space="preserve">.dropdown-submenu.abre-izquierda &gt; .dropdown-menu {</w:t>
+      </w:r>
+      <w:r>
+        <w:br/>
+      </w:r>
+      <w:r>
+        <w:rPr>
+          <w:color w:val="111827"/>
+          <w:sz w:val="18"/>
+          <w:szCs w:val="18"/>
+          <w:rFonts w:ascii="Courier New" w:cs="Courier New" w:eastAsia="Courier New" w:hAnsi="Courier New"/>
+        </w:rPr>
+        <w:t xml:space="preserve">    left: auto;</w:t>
+      </w:r>
+      <w:r>
+        <w:br/>
+      </w:r>
+      <w:r>
+        <w:rPr>
+          <w:color w:val="111827"/>
+          <w:sz w:val="18"/>
+          <w:szCs w:val="18"/>
+          <w:rFonts w:ascii="Courier New" w:cs="Courier New" w:eastAsia="Courier New" w:hAnsi="Courier New"/>
+        </w:rPr>
+        <w:t xml:space="preserve">    right: 100%;</w:t>
+      </w:r>
+      <w:r>
+        <w:br/>
+      </w:r>
+      <w:r>
+        <w:rPr>
+          <w:color w:val="111827"/>
+          <w:sz w:val="18"/>
+          <w:szCs w:val="18"/>
+          <w:rFonts w:ascii="Courier New" w:cs="Courier New" w:eastAsia="Courier New" w:hAnsi="Courier New"/>
+        </w:rPr>
+        <w:t xml:space="preserve">    margin: 0 1px 0 0;</w:t>
+      </w:r>
+      <w:r>
+        <w:br/>
+      </w:r>
+      <w:r>
+        <w:rPr>
+          <w:color w:val="111827"/>
+          <w:sz w:val="18"/>
+          <w:szCs w:val="18"/>
+          <w:rFonts w:ascii="Courier New" w:cs="Courier New" w:eastAsia="Courier New" w:hAnsi="Courier New"/>
+        </w:rPr>
+        <w:t xml:space="preserve">}</w:t>
+      </w:r>
+    </w:p>
+    <w:p>
+      <w:pPr>
+        <w:spacing w:after="160" w:line="300"/>
+      </w:pPr>
+      <w:r>
+        <w:rPr>
+          <w:sz w:val="21"/>
+          <w:szCs w:val="21"/>
+        </w:rPr>
+        <w:t xml:space="preserve">Se verificó en vivo contra el servidor de desarrollo real (no en un mock): con el arreglo, el mismo submenú de Renglones pasó de dibujarse en x=1440–1600 (fuera de la ventana) a x=1064–1224 (dentro, a la izquierda del ítem). Como el fix vive en el JS/CSS compartido del navbar, de paso deja mejor protegidos todos los demás submenús anidados del sitio (Tipos, Retenciones, Liquidaciones, Entidades) ante el mismo problema si alguna vez la ventana es angosta o el ítem queda cerca del borde.</w:t>
+      </w:r>
+    </w:p>
+    <w:p>
+      <w:pPr>
+        <w:pStyle w:val="Heading1"/>
+        <w:pBdr>
+          <w:bottom w:val="single" w:color="0F6B4C" w:sz="6" w:space="4"/>
+        </w:pBdr>
+        <w:spacing w:before="360" w:after="160"/>
+      </w:pPr>
+      <w:r>
+        <w:rPr>
+          <w:b/>
+          <w:bCs/>
+          <w:color w:val="0F6B4C"/>
+          <w:sz w:val="30"/>
+          <w:szCs w:val="30"/>
+        </w:rPr>
+        <w:t xml:space="preserve">15. Pendiente: llevar a producción</w:t>
+      </w:r>
+    </w:p>
+    <w:p>
+      <w:pPr>
+        <w:spacing w:after="160" w:line="300"/>
+      </w:pPr>
+      <w:r>
+        <w:rPr>
+          <w:sz w:val="21"/>
+          <w:szCs w:val="21"/>
+        </w:rPr>
+        <w:t xml:space="preserve">Todo lo de este documento está probado y funcionando en la máquina de desarrollo (Windows, base de datos local). El servidor de producción (Ubuntu, waitress + systemd) todavía no tiene ninguno de estos cambios — se lleva el lunes. Ahí hay que repetir, sobre ese servidor:</w:t>
+      </w:r>
+    </w:p>
+    <w:p>
+      <w:pPr>
+        <w:pStyle w:val="ListParagraph"/>
+        <w:numPr>
+          <w:ilvl w:val="0"/>
+          <w:numId w:val="2"/>
+        </w:numPr>
+        <w:spacing w:after="80" w:line="290"/>
+      </w:pPr>
+      <w:r>
+        <w:rPr>
+          <w:sz w:val="21"/>
+          <w:szCs w:val="21"/>
+        </w:rPr>
+        <w:t xml:space="preserve">1. Traer el código nuevo (git pull, o el mecanismo de despliegue que ya usen).</w:t>
+      </w:r>
+    </w:p>
+    <w:p>
+      <w:pPr>
+        <w:pStyle w:val="ListParagraph"/>
+        <w:numPr>
+          <w:ilvl w:val="0"/>
+          <w:numId w:val="2"/>
+        </w:numPr>
+        <w:spacing w:after="80" w:line="290"/>
+      </w:pPr>
+      <w:r>
+        <w:rPr>
+          <w:sz w:val="21"/>
+          <w:szCs w:val="21"/>
+        </w:rPr>
+        <w:t xml:space="preserve">2. python manage.py makemigrations remitos y python manage.py migrate, con el mismo cuidado del orden explicado en la sección 13 (dependencia circular por 0002_seed_condicion_venta.py) — o, más simple, copiar directamente remitos/migrations/0001_initial.py ya generado en desarrollo en vez de regenerarlo, para no repetir el mismo paso extra.</w:t>
+      </w:r>
+    </w:p>
+    <w:p>
+      <w:pPr>
+        <w:pStyle w:val="ListParagraph"/>
+        <w:numPr>
+          <w:ilvl w:val="0"/>
+          <w:numId w:val="2"/>
+        </w:numPr>
+        <w:spacing w:after="80" w:line="290"/>
+      </w:pPr>
+      <w:r>
+        <w:rPr>
+          <w:sz w:val="21"/>
+          <w:szCs w:val="21"/>
+        </w:rPr>
+        <w:t xml:space="preserve">3. Reiniciar el servicio systemd de producción (no el runserver de desarrollo).</w:t>
+      </w:r>
+    </w:p>
+    <w:p>
+      <w:pPr>
+        <w:pStyle w:val="ListParagraph"/>
+        <w:numPr>
+          <w:ilvl w:val="0"/>
+          <w:numId w:val="2"/>
+        </w:numPr>
+        <w:spacing w:after="80" w:line="290"/>
+      </w:pPr>
+      <w:r>
+        <w:rPr>
+          <w:sz w:val="21"/>
+          <w:szCs w:val="21"/>
+        </w:rPr>
+        <w:t xml:space="preserve">4. Asignar el grupo "Remitos" a los usuarios correspondientes desde el /admin/ de producción (es una base de datos distinta a la de desarrollo, así que los grupos/permisos hay que asignarlos de nuevo ahí).</w:t>
+      </w:r>
+    </w:p>
+    <w:p>
+      <w:pPr>
+        <w:pBdr>
+          <w:left w:val="single" w:color="9A3412" w:sz="18" w:space="6"/>
+        </w:pBdr>
+        <w:shd w:fill="FFF7ED" w:val="clear"/>
         <w:spacing w:before="60" w:after="200" w:line="290"/>
         <w:ind w:left="120"/>
       </w:pPr>
@@ -9555,18 +9987,19 @@
         <w:rPr>
           <w:b/>
           <w:bCs/>
-          <w:color w:val="166534"/>
+          <w:color w:val="9A3412"/>
           <w:sz w:val="20"/>
           <w:szCs w:val="20"/>
         </w:rPr>
-      </w:r>
-      <w:r>
-        <w:rPr>
-          <w:color w:val="166534"/>
+        <w:t xml:space="preserve">Nota aparte: </w:t>
+      </w:r>
+      <w:r>
+        <w:rPr>
+          <w:color w:val="9A3412"/>
           <w:sz w:val="20"/>
           <w:szCs w:val="20"/>
         </w:rPr>
-        <w:t xml:space="preserve">Con eso el módulo queda operativo end-to-end: alta de Remito → alta de renglones (genera los Movimiento) → confirmación de kilogramos_confirmados cuando corresponda → impresión → reportes.</w:t>
+        <w:t xml:space="preserve">De paso: se detectó (sección aparte, no documentada acá por no ser del ámbito de Remitos) que la base de producción tiene pendiente una migración vieja de Entidad (0004_entidad_activo, columna 'activo') que nunca se aplicó ahí — conviene revisarla con showmigrations antes o junto con este despliegue, ya que algunas pantallas de Movimientos ya la necesitan.</w:t>
       </w:r>
     </w:p>
     <w:sectPr>

</xml_diff>